<commit_message>
Replace old studios with six Power BI, Excel, SQL, and Python projects.
Co-authored-by: Cursor <cursoragent@cursor.com>
</commit_message>
<xml_diff>
--- a/Thakur_Nihar_Singh_Resume.docx
+++ b/Thakur_Nihar_Singh_Resume.docx
@@ -256,7 +256,7 @@
         <w:pStyle w:val="Heading1"/>
         <w:spacing w:before="104" w:after="42"/>
         <w:rPr>
-          <w:rFonts w:ascii="Liberation Sans" w:hAnsi="Liberation Sans"/>
+          <w:rFonts w:ascii="Liberation Sans" w:hAnsi="Liberation Sans" w:hint="eastAsia"/>
           <w:color w:val="147D7E"/>
           <w:sz w:val="20"/>
         </w:rPr>
@@ -299,7 +299,7 @@
         <w:pStyle w:val="Heading1"/>
         <w:spacing w:before="104" w:after="42"/>
         <w:rPr>
-          <w:rFonts w:ascii="Liberation Sans" w:hAnsi="Liberation Sans"/>
+          <w:rFonts w:ascii="Liberation Sans" w:hAnsi="Liberation Sans" w:hint="eastAsia"/>
           <w:color w:val="147D7E"/>
           <w:sz w:val="20"/>
         </w:rPr>
@@ -494,7 +494,7 @@
         <w:pStyle w:val="Heading1"/>
         <w:spacing w:before="104" w:after="42"/>
         <w:rPr>
-          <w:rFonts w:ascii="Liberation Sans" w:hAnsi="Liberation Sans"/>
+          <w:rFonts w:ascii="Liberation Sans" w:hAnsi="Liberation Sans" w:hint="eastAsia"/>
           <w:color w:val="147D7E"/>
           <w:sz w:val="20"/>
         </w:rPr>
@@ -592,7 +592,7 @@
         <w:pStyle w:val="Heading1"/>
         <w:spacing w:before="104" w:after="42"/>
         <w:rPr>
-          <w:rFonts w:ascii="Liberation Sans" w:hAnsi="Liberation Sans"/>
+          <w:rFonts w:ascii="Liberation Sans" w:hAnsi="Liberation Sans" w:hint="eastAsia"/>
           <w:color w:val="147D7E"/>
           <w:sz w:val="20"/>
         </w:rPr>
@@ -779,7 +779,7 @@
         <w:pStyle w:val="Heading1"/>
         <w:spacing w:before="104" w:after="42"/>
         <w:rPr>
-          <w:rFonts w:ascii="Liberation Sans" w:hAnsi="Liberation Sans"/>
+          <w:rFonts w:ascii="Liberation Sans" w:hAnsi="Liberation Sans" w:hint="eastAsia"/>
           <w:color w:val="147D7E"/>
           <w:sz w:val="20"/>
         </w:rPr>

</xml_diff>